<commit_message>
fix: fixed missing metric in ragwise
</commit_message>
<xml_diff>
--- a/CVs/MohamedAmineJmal.docx
+++ b/CVs/MohamedAmineJmal.docx
@@ -204,37 +204,7 @@
           <w:sz w:val="16"/>
           <w:szCs w:val="16"/>
         </w:rPr>
-        <w:t xml:space="preserve">Jun </w:t>
-      </w:r>
-      <w:r>
-        <w:rPr>
-          <w:b/>
-          <w:bCs/>
-          <w:color w:val="4B5563"/>
-          <w:sz w:val="16"/>
-          <w:szCs w:val="16"/>
-        </w:rPr>
-        <w:t xml:space="preserve">2026 – </w:t>
-      </w:r>
-      <w:r>
-        <w:rPr>
-          <w:b/>
-          <w:bCs/>
-          <w:color w:val="4B5563"/>
-          <w:sz w:val="16"/>
-          <w:szCs w:val="16"/>
-        </w:rPr>
-        <w:t xml:space="preserve">Aug </w:t>
-      </w:r>
-      <w:r>
-        <w:rPr>
-          <w:b/>
-          <w:bCs/>
-          <w:color w:val="4B5563"/>
-          <w:sz w:val="16"/>
-          <w:szCs w:val="16"/>
-        </w:rPr>
-        <w:t>2026</w:t>
+        <w:t>Jun 2026 – Aug 2026</w:t>
       </w:r>
     </w:p>
     <w:p>
@@ -259,7 +229,7 @@
         <w:pStyle w:val="ListParagraph"/>
         <w:numPr>
           <w:ilvl w:val="0"/>
-          <w:numId w:val="3"/>
+          <w:numId w:val="4"/>
         </w:numPr>
         <w:spacing w:before="0" w:after="28"/>
         <w:rPr/>
@@ -277,7 +247,7 @@
         <w:pStyle w:val="ListParagraph"/>
         <w:numPr>
           <w:ilvl w:val="0"/>
-          <w:numId w:val="1"/>
+          <w:numId w:val="2"/>
         </w:numPr>
         <w:spacing w:before="0" w:after="28"/>
         <w:rPr>
@@ -298,7 +268,7 @@
         <w:pStyle w:val="ListParagraph"/>
         <w:numPr>
           <w:ilvl w:val="0"/>
-          <w:numId w:val="1"/>
+          <w:numId w:val="2"/>
         </w:numPr>
         <w:spacing w:before="0" w:after="28"/>
         <w:rPr/>
@@ -316,7 +286,7 @@
         <w:pStyle w:val="ListParagraph"/>
         <w:numPr>
           <w:ilvl w:val="0"/>
-          <w:numId w:val="1"/>
+          <w:numId w:val="2"/>
         </w:numPr>
         <w:spacing w:before="0" w:after="28"/>
         <w:rPr>
@@ -360,17 +330,7 @@
           <w:sz w:val="16"/>
           <w:szCs w:val="16"/>
         </w:rPr>
-        <w:t xml:space="preserve">Mar </w:t>
-      </w:r>
-      <w:r>
-        <w:rPr>
-          <w:b/>
-          <w:bCs/>
-          <w:color w:val="4B5563"/>
-          <w:sz w:val="16"/>
-          <w:szCs w:val="16"/>
-        </w:rPr>
-        <w:t>2025 – Present</w:t>
+        <w:t>Mar 2025 – Present</w:t>
       </w:r>
     </w:p>
     <w:p>
@@ -394,37 +354,7 @@
           <w:sz w:val="17"/>
           <w:szCs w:val="17"/>
         </w:rPr>
-        <w:t xml:space="preserve">Bun, </w:t>
-      </w:r>
-      <w:r>
-        <w:rPr>
-          <w:b w:val="false"/>
-          <w:bCs w:val="false"/>
-          <w:color w:val="4B5563"/>
-          <w:sz w:val="17"/>
-          <w:szCs w:val="17"/>
-        </w:rPr>
-        <w:t xml:space="preserve">Hono, Drizzle ORM, </w:t>
-      </w:r>
-      <w:r>
-        <w:rPr>
-          <w:b w:val="false"/>
-          <w:bCs w:val="false"/>
-          <w:color w:val="4B5563"/>
-          <w:sz w:val="17"/>
-          <w:szCs w:val="17"/>
-        </w:rPr>
-        <w:t>PostgreSQL, JWT, Docker,</w:t>
-      </w:r>
-      <w:r>
-        <w:rPr>
-          <w:b w:val="false"/>
-          <w:bCs w:val="false"/>
-          <w:color w:val="4B5563"/>
-          <w:sz w:val="17"/>
-          <w:szCs w:val="17"/>
-        </w:rPr>
-        <w:t xml:space="preserve"> Shadcn, Next.js</w:t>
+        <w:t>Bun, Hono, Drizzle ORM, PostgreSQL, JWT, Docker, Shadcn, Next.js</w:t>
       </w:r>
     </w:p>
     <w:p>
@@ -432,7 +362,7 @@
         <w:pStyle w:val="ListParagraph"/>
         <w:numPr>
           <w:ilvl w:val="0"/>
-          <w:numId w:val="1"/>
+          <w:numId w:val="2"/>
         </w:numPr>
         <w:spacing w:before="0" w:after="28"/>
         <w:rPr>
@@ -453,7 +383,7 @@
         <w:pStyle w:val="ListParagraph"/>
         <w:numPr>
           <w:ilvl w:val="0"/>
-          <w:numId w:val="1"/>
+          <w:numId w:val="2"/>
         </w:numPr>
         <w:spacing w:before="0" w:after="28"/>
         <w:rPr>
@@ -525,8 +455,72 @@
           <w:sz w:val="16"/>
           <w:szCs w:val="16"/>
         </w:rPr>
-        <w:t xml:space="preserve">Express, FastAPI, RabbitMQ, Redis, MongoDB, </w:t>
-      </w:r>
+        <w:t>Express, FastAPI, RabbitMQ, Redis, MongoDB, SSE, JWT, Docker, LSTM, Next.js</w:t>
+      </w:r>
+    </w:p>
+    <w:p>
+      <w:pPr>
+        <w:pStyle w:val="ListParagraph"/>
+        <w:numPr>
+          <w:ilvl w:val="0"/>
+          <w:numId w:val="2"/>
+        </w:numPr>
+        <w:spacing w:before="0" w:after="28"/>
+        <w:rPr/>
+      </w:pPr>
+      <w:r>
+        <w:rPr>
+          <w:sz w:val="17"/>
+          <w:szCs w:val="17"/>
+        </w:rPr>
+        <w:t>1st place, AI Night Challenge hackathon; later extended into a production-oriented architecture.</w:t>
+      </w:r>
+    </w:p>
+    <w:p>
+      <w:pPr>
+        <w:pStyle w:val="ListParagraph"/>
+        <w:numPr>
+          <w:ilvl w:val="0"/>
+          <w:numId w:val="2"/>
+        </w:numPr>
+        <w:spacing w:before="0" w:after="28"/>
+        <w:rPr/>
+      </w:pPr>
+      <w:r>
+        <w:rPr>
+          <w:sz w:val="17"/>
+          <w:szCs w:val="17"/>
+        </w:rPr>
+        <w:t>Real-time sensor pipeline using RabbitMQ topic exchanges, time-bucketed Redis keys with last-known-value imputation, and per-sensor JWT auth with encrypted keys in MongoDB across multiple locations; two LSTM models handle flow forecasting and false-data anomaly detection.</w:t>
+      </w:r>
+    </w:p>
+    <w:p>
+      <w:pPr>
+        <w:pStyle w:val="Normal"/>
+        <w:spacing w:before="55" w:after="4"/>
+        <w:rPr/>
+      </w:pPr>
+      <w:r>
+        <w:rPr>
+          <w:b/>
+          <w:bCs/>
+          <w:color w:val="1F2937"/>
+          <w:sz w:val="19"/>
+          <w:szCs w:val="19"/>
+        </w:rPr>
+        <w:t>RAGwise – RAG Evaluation Pipeline (Ongoing)</w:t>
+      </w:r>
+      <w:r>
+        <w:rPr/>
+        <w:tab/>
+      </w:r>
+    </w:p>
+    <w:p>
+      <w:pPr>
+        <w:pStyle w:val="Normal"/>
+        <w:spacing w:before="0" w:after="35"/>
+        <w:rPr/>
+      </w:pPr>
       <w:r>
         <w:rPr>
           <w:i/>
@@ -535,17 +529,7 @@
           <w:sz w:val="16"/>
           <w:szCs w:val="16"/>
         </w:rPr>
-        <w:t>SSE,</w:t>
-      </w:r>
-      <w:r>
-        <w:rPr>
-          <w:i/>
-          <w:iCs/>
-          <w:color w:val="4B5563"/>
-          <w:sz w:val="16"/>
-          <w:szCs w:val="16"/>
-        </w:rPr>
-        <w:t xml:space="preserve"> JWT, Docker, LSTM, Next.js</w:t>
+        <w:t>Docling, BGE-M3, Qdrant, LangGraph, RAGAS, Langfuse, Cohere Rerank, FastAPI</w:t>
       </w:r>
     </w:p>
     <w:p>
@@ -553,7 +537,7 @@
         <w:pStyle w:val="ListParagraph"/>
         <w:numPr>
           <w:ilvl w:val="0"/>
-          <w:numId w:val="1"/>
+          <w:numId w:val="2"/>
         </w:numPr>
         <w:spacing w:before="0" w:after="28"/>
         <w:rPr/>
@@ -563,7 +547,7 @@
           <w:sz w:val="17"/>
           <w:szCs w:val="17"/>
         </w:rPr>
-        <w:t>1st place, AI Night Challenge hackathon; later extended into a production-oriented architecture.</w:t>
+        <w:t>Built an evaluation-driven RAG pipeline over ~3,069 arXiv papers: parsed with Docling, embedded with BGE-M3, indexed in Qdrant, orchestrated with LangGraph.</w:t>
       </w:r>
     </w:p>
     <w:p>
@@ -571,7 +555,7 @@
         <w:pStyle w:val="ListParagraph"/>
         <w:numPr>
           <w:ilvl w:val="0"/>
-          <w:numId w:val="1"/>
+          <w:numId w:val="2"/>
         </w:numPr>
         <w:spacing w:before="0" w:after="28"/>
         <w:rPr/>
@@ -581,45 +565,7 @@
           <w:sz w:val="17"/>
           <w:szCs w:val="17"/>
         </w:rPr>
-        <w:t>Real-time sensor pipeline using RabbitMQ topic exchanges, time-bucketed Redis keys with last-known-value imputation, and per-sensor JWT auth with encrypted keys in MongoDB across multiple locations; two LSTM models handle flow forecasting and false-data anomaly detection.</w:t>
-      </w:r>
-    </w:p>
-    <w:p>
-      <w:pPr>
-        <w:pStyle w:val="Normal"/>
-        <w:spacing w:before="55" w:after="4"/>
-        <w:rPr/>
-      </w:pPr>
-      <w:r>
-        <w:rPr>
-          <w:b/>
-          <w:bCs/>
-          <w:color w:val="1F2937"/>
-          <w:sz w:val="19"/>
-          <w:szCs w:val="19"/>
-        </w:rPr>
-        <w:t>RAGwise – RAG Evaluation Pipeline (Ongoing)</w:t>
-      </w:r>
-      <w:r>
-        <w:rPr/>
-        <w:tab/>
-      </w:r>
-    </w:p>
-    <w:p>
-      <w:pPr>
-        <w:pStyle w:val="Normal"/>
-        <w:spacing w:before="0" w:after="35"/>
-        <w:rPr/>
-      </w:pPr>
-      <w:r>
-        <w:rPr>
-          <w:i/>
-          <w:iCs/>
-          <w:color w:val="4B5563"/>
-          <w:sz w:val="16"/>
-          <w:szCs w:val="16"/>
-        </w:rPr>
-        <w:t>Docling, BGE-M3, Qdrant, LangGraph, RAGAS, Langfuse, Cohere Rerank, FastAPI</w:t>
+        <w:t>Used RAGAS to build a knowledge graph from 200 document chunks (200 nodes, 11K+ relations) and auto-generate a 100-question testset with expected answers and source references; tracked evaluation runs with Langfuse.</w:t>
       </w:r>
     </w:p>
     <w:p>
@@ -627,17 +573,27 @@
         <w:pStyle w:val="ListParagraph"/>
         <w:numPr>
           <w:ilvl w:val="0"/>
-          <w:numId w:val="1"/>
+          <w:numId w:val="2"/>
         </w:numPr>
         <w:spacing w:before="0" w:after="28"/>
-        <w:rPr/>
-      </w:pPr>
-      <w:r>
-        <w:rPr>
-          <w:sz w:val="17"/>
-          <w:szCs w:val="17"/>
-        </w:rPr>
-        <w:t>Built an evaluation-driven RAG pipeline over ~3,069 arXiv papers: parsed with Docling, embedded with BGE-M3, indexed in Qdrant, orchestrated with LangGraph.</w:t>
+        <w:rPr>
+          <w:sz w:val="17"/>
+          <w:szCs w:val="17"/>
+        </w:rPr>
+      </w:pPr>
+      <w:r>
+        <w:rPr>
+          <w:sz w:val="17"/>
+          <w:szCs w:val="17"/>
+        </w:rPr>
+        <w:t xml:space="preserve">Benchmarked a hybrid dense+sparse retrieval baseline (relevance 0.73, precision 0.45, recall 0.67, faithfulness 0.92, 1.65s latency) against a Cohere-reranked variant that lifted precision 33% (→0.60), recall 7% (→0.72), and faithfulness 4% (→0.96), </w:t>
+      </w:r>
+      <w:r>
+        <w:rPr>
+          <w:sz w:val="17"/>
+          <w:szCs w:val="17"/>
+        </w:rPr>
+        <w:t>holding relevance flat and trading off latency (→3.22s).</w:t>
       </w:r>
     </w:p>
     <w:p>
@@ -645,7 +601,7 @@
         <w:pStyle w:val="ListParagraph"/>
         <w:numPr>
           <w:ilvl w:val="0"/>
-          <w:numId w:val="1"/>
+          <w:numId w:val="2"/>
         </w:numPr>
         <w:spacing w:before="0" w:after="28"/>
         <w:rPr/>
@@ -655,53 +611,7 @@
           <w:sz w:val="17"/>
           <w:szCs w:val="17"/>
         </w:rPr>
-        <w:t>Used RAGAS to build a knowledge graph from 200 document chunks (200 nodes, 11K+ relations) and auto-generate a 100-question testset with expected answers and source references; tracked evaluation runs with Langfuse.</w:t>
-      </w:r>
-    </w:p>
-    <w:p>
-      <w:pPr>
-        <w:pStyle w:val="ListParagraph"/>
-        <w:numPr>
-          <w:ilvl w:val="0"/>
-          <w:numId w:val="1"/>
-        </w:numPr>
-        <w:spacing w:before="0" w:after="28"/>
-        <w:rPr>
-          <w:sz w:val="17"/>
-          <w:szCs w:val="17"/>
-        </w:rPr>
-      </w:pPr>
-      <w:r>
-        <w:rPr>
-          <w:sz w:val="17"/>
-          <w:szCs w:val="17"/>
-        </w:rPr>
-        <w:t xml:space="preserve">Benchmarked a hybrid dense+sparse retrieval baseline (precision 0.45, recall 0.67, faithfulness 0.92, 1.65s latency) against a Cohere-reranked variant that lifted precision 33% (→0.60) and recall to 0.72 (faithfulness 0.96), trading off latency (→3.22s). </w:t>
-      </w:r>
-    </w:p>
-    <w:p>
-      <w:pPr>
-        <w:pStyle w:val="ListParagraph"/>
-        <w:numPr>
-          <w:ilvl w:val="0"/>
-          <w:numId w:val="1"/>
-        </w:numPr>
-        <w:spacing w:before="0" w:after="28"/>
-        <w:rPr/>
-      </w:pPr>
-      <w:r>
-        <w:rPr>
-          <w:sz w:val="17"/>
-          <w:szCs w:val="17"/>
-        </w:rPr>
-        <w:t xml:space="preserve">Diagnosed and fixed a bug in Docling's HTML backend that silently dropped &lt;table&gt; elements nested inside &lt;figure&gt; tags (common in LaTeXML/arXiv exports); </w:t>
-      </w:r>
-      <w:r>
-        <w:rPr>
-          <w:sz w:val="17"/>
-          <w:szCs w:val="17"/>
-        </w:rPr>
-        <w:t xml:space="preserve">submitted and merged the fix upstream as </w:t>
+        <w:t xml:space="preserve">Diagnosed and fixed a bug in Docling's HTML backend that silently dropped &lt;table&gt; elements nested inside &lt;figure&gt; tags (common in LaTeXML/arXiv exports); submitted and merged the fix upstream as </w:t>
       </w:r>
       <w:hyperlink r:id="rId5">
         <w:r>
@@ -883,37 +793,7 @@
           <w:sz w:val="16"/>
           <w:szCs w:val="16"/>
         </w:rPr>
-        <w:t xml:space="preserve">Sep </w:t>
-      </w:r>
-      <w:r>
-        <w:rPr>
-          <w:b/>
-          <w:bCs/>
-          <w:color w:val="4B5563"/>
-          <w:sz w:val="16"/>
-          <w:szCs w:val="16"/>
-        </w:rPr>
-        <w:t xml:space="preserve">2023 – </w:t>
-      </w:r>
-      <w:r>
-        <w:rPr>
-          <w:b/>
-          <w:bCs/>
-          <w:color w:val="4B5563"/>
-          <w:sz w:val="16"/>
-          <w:szCs w:val="16"/>
-        </w:rPr>
-        <w:t xml:space="preserve">Jul </w:t>
-      </w:r>
-      <w:r>
-        <w:rPr>
-          <w:b/>
-          <w:bCs/>
-          <w:color w:val="4B5563"/>
-          <w:sz w:val="16"/>
-          <w:szCs w:val="16"/>
-        </w:rPr>
-        <w:t>2028</w:t>
+        <w:t>Sep 2023 – Jul 2028</w:t>
       </w:r>
     </w:p>
     <w:p>
@@ -1080,7 +960,7 @@
         <w:pStyle w:val="ListParagraph"/>
         <w:numPr>
           <w:ilvl w:val="0"/>
-          <w:numId w:val="1"/>
+          <w:numId w:val="2"/>
         </w:numPr>
         <w:spacing w:before="0" w:after="28"/>
         <w:rPr/>
@@ -1137,7 +1017,7 @@
         <w:pStyle w:val="ListParagraph"/>
         <w:numPr>
           <w:ilvl w:val="0"/>
-          <w:numId w:val="1"/>
+          <w:numId w:val="2"/>
         </w:numPr>
         <w:spacing w:before="0" w:after="28"/>
         <w:rPr/>
@@ -1189,7 +1069,7 @@
         <w:pStyle w:val="ListParagraph"/>
         <w:numPr>
           <w:ilvl w:val="0"/>
-          <w:numId w:val="1"/>
+          <w:numId w:val="2"/>
         </w:numPr>
         <w:spacing w:before="0" w:after="28"/>
         <w:rPr>
@@ -1281,6 +1161,7 @@
         </w:tabs>
         <w:ind w:start="1080" w:hanging="360"/>
       </w:pPr>
+      <w:rPr/>
     </w:lvl>
     <w:lvl w:ilvl="2">
       <w:start w:val="1"/>
@@ -1293,6 +1174,7 @@
         </w:tabs>
         <w:ind w:start="1440" w:hanging="360"/>
       </w:pPr>
+      <w:rPr/>
     </w:lvl>
     <w:lvl w:ilvl="3">
       <w:start w:val="1"/>
@@ -1305,6 +1187,7 @@
         </w:tabs>
         <w:ind w:start="1800" w:hanging="360"/>
       </w:pPr>
+      <w:rPr/>
     </w:lvl>
     <w:lvl w:ilvl="4">
       <w:start w:val="1"/>
@@ -1317,6 +1200,7 @@
         </w:tabs>
         <w:ind w:start="2160" w:hanging="360"/>
       </w:pPr>
+      <w:rPr/>
     </w:lvl>
     <w:lvl w:ilvl="5">
       <w:start w:val="1"/>
@@ -1329,6 +1213,7 @@
         </w:tabs>
         <w:ind w:start="2520" w:hanging="360"/>
       </w:pPr>
+      <w:rPr/>
     </w:lvl>
     <w:lvl w:ilvl="6">
       <w:start w:val="1"/>
@@ -1341,6 +1226,7 @@
         </w:tabs>
         <w:ind w:start="2880" w:hanging="360"/>
       </w:pPr>
+      <w:rPr/>
     </w:lvl>
     <w:lvl w:ilvl="7">
       <w:start w:val="1"/>
@@ -1353,6 +1239,7 @@
         </w:tabs>
         <w:ind w:start="3240" w:hanging="360"/>
       </w:pPr>
+      <w:rPr/>
     </w:lvl>
     <w:lvl w:ilvl="8">
       <w:start w:val="1"/>
@@ -1365,9 +1252,131 @@
         </w:tabs>
         <w:ind w:start="3600" w:hanging="360"/>
       </w:pPr>
+      <w:rPr/>
     </w:lvl>
   </w:abstractNum>
   <w:abstractNum w:abstractNumId="2">
+    <w:lvl w:ilvl="0">
+      <w:start w:val="1"/>
+      <w:numFmt w:val="bullet"/>
+      <w:lvlText w:val=""/>
+      <w:lvlJc w:val="start"/>
+      <w:pPr>
+        <w:tabs>
+          <w:tab w:val="num" w:pos="0"/>
+        </w:tabs>
+        <w:ind w:start="260" w:hanging="200"/>
+      </w:pPr>
+      <w:rPr>
+        <w:rFonts w:ascii="Symbol" w:hAnsi="Symbol" w:cs="Symbol" w:hint="default"/>
+      </w:rPr>
+    </w:lvl>
+    <w:lvl w:ilvl="1">
+      <w:start w:val="1"/>
+      <w:numFmt w:val="decimal"/>
+      <w:lvlText w:val="%2."/>
+      <w:lvlJc w:val="start"/>
+      <w:pPr>
+        <w:tabs>
+          <w:tab w:val="num" w:pos="1080"/>
+        </w:tabs>
+        <w:ind w:start="1080" w:hanging="360"/>
+      </w:pPr>
+      <w:rPr/>
+    </w:lvl>
+    <w:lvl w:ilvl="2">
+      <w:start w:val="1"/>
+      <w:numFmt w:val="decimal"/>
+      <w:lvlText w:val="%3."/>
+      <w:lvlJc w:val="start"/>
+      <w:pPr>
+        <w:tabs>
+          <w:tab w:val="num" w:pos="1440"/>
+        </w:tabs>
+        <w:ind w:start="1440" w:hanging="360"/>
+      </w:pPr>
+      <w:rPr/>
+    </w:lvl>
+    <w:lvl w:ilvl="3">
+      <w:start w:val="1"/>
+      <w:numFmt w:val="decimal"/>
+      <w:lvlText w:val="%4."/>
+      <w:lvlJc w:val="start"/>
+      <w:pPr>
+        <w:tabs>
+          <w:tab w:val="num" w:pos="1800"/>
+        </w:tabs>
+        <w:ind w:start="1800" w:hanging="360"/>
+      </w:pPr>
+      <w:rPr/>
+    </w:lvl>
+    <w:lvl w:ilvl="4">
+      <w:start w:val="1"/>
+      <w:numFmt w:val="decimal"/>
+      <w:lvlText w:val="%5."/>
+      <w:lvlJc w:val="start"/>
+      <w:pPr>
+        <w:tabs>
+          <w:tab w:val="num" w:pos="2160"/>
+        </w:tabs>
+        <w:ind w:start="2160" w:hanging="360"/>
+      </w:pPr>
+      <w:rPr/>
+    </w:lvl>
+    <w:lvl w:ilvl="5">
+      <w:start w:val="1"/>
+      <w:numFmt w:val="decimal"/>
+      <w:lvlText w:val="%6."/>
+      <w:lvlJc w:val="start"/>
+      <w:pPr>
+        <w:tabs>
+          <w:tab w:val="num" w:pos="2520"/>
+        </w:tabs>
+        <w:ind w:start="2520" w:hanging="360"/>
+      </w:pPr>
+      <w:rPr/>
+    </w:lvl>
+    <w:lvl w:ilvl="6">
+      <w:start w:val="1"/>
+      <w:numFmt w:val="decimal"/>
+      <w:lvlText w:val="%7."/>
+      <w:lvlJc w:val="start"/>
+      <w:pPr>
+        <w:tabs>
+          <w:tab w:val="num" w:pos="2880"/>
+        </w:tabs>
+        <w:ind w:start="2880" w:hanging="360"/>
+      </w:pPr>
+      <w:rPr/>
+    </w:lvl>
+    <w:lvl w:ilvl="7">
+      <w:start w:val="1"/>
+      <w:numFmt w:val="decimal"/>
+      <w:lvlText w:val="%8."/>
+      <w:lvlJc w:val="start"/>
+      <w:pPr>
+        <w:tabs>
+          <w:tab w:val="num" w:pos="3240"/>
+        </w:tabs>
+        <w:ind w:start="3240" w:hanging="360"/>
+      </w:pPr>
+      <w:rPr/>
+    </w:lvl>
+    <w:lvl w:ilvl="8">
+      <w:start w:val="1"/>
+      <w:numFmt w:val="decimal"/>
+      <w:lvlText w:val="%9."/>
+      <w:lvlJc w:val="start"/>
+      <w:pPr>
+        <w:tabs>
+          <w:tab w:val="num" w:pos="3600"/>
+        </w:tabs>
+        <w:ind w:start="3600" w:hanging="360"/>
+      </w:pPr>
+      <w:rPr/>
+    </w:lvl>
+  </w:abstractNum>
+  <w:abstractNum w:abstractNumId="3">
     <w:lvl w:ilvl="0">
       <w:start w:val="1"/>
       <w:numFmt w:val="none"/>
@@ -1493,7 +1502,10 @@
     <w:abstractNumId w:val="2"/>
   </w:num>
   <w:num w:numId="3">
-    <w:abstractNumId w:val="1"/>
+    <w:abstractNumId w:val="3"/>
+  </w:num>
+  <w:num w:numId="4">
+    <w:abstractNumId w:val="2"/>
     <w:lvlOverride w:ilvl="0">
       <w:startOverride w:val="1"/>
     </w:lvlOverride>
@@ -1520,6 +1532,7 @@
     <w:name w:val="Normal"/>
     <w:pPr>
       <w:widowControl/>
+      <w:suppressAutoHyphens w:val="true"/>
       <w:bidi w:val="0"/>
       <w:spacing w:before="0" w:after="0"/>
       <w:jc w:val="start"/>
@@ -1604,11 +1617,17 @@
       <w:u w:val="single"/>
     </w:rPr>
   </w:style>
-  <w:style w:type="character" w:styleId="FootnoteCharacters">
-    <w:name w:val="Footnote Characters"/>
+  <w:style w:type="character" w:styleId="FootnoteCharactersuser">
+    <w:name w:val="Footnote Characters (user)"/>
     <w:uiPriority w:val="99"/>
     <w:semiHidden/>
     <w:unhideWhenUsed/>
+    <w:rPr>
+      <w:vertAlign w:val="superscript"/>
+    </w:rPr>
+  </w:style>
+  <w:style w:type="character" w:styleId="FootnoteCharacters">
+    <w:name w:val="Footnote Characters"/>
     <w:rPr>
       <w:vertAlign w:val="superscript"/>
     </w:rPr>
@@ -1630,11 +1649,17 @@
       <w:szCs w:val="20"/>
     </w:rPr>
   </w:style>
-  <w:style w:type="character" w:styleId="EndnoteCharacters">
-    <w:name w:val="Endnote Characters"/>
+  <w:style w:type="character" w:styleId="EndnoteCharactersuser">
+    <w:name w:val="Endnote Characters (user)"/>
     <w:uiPriority w:val="99"/>
     <w:semiHidden/>
     <w:unhideWhenUsed/>
+    <w:rPr>
+      <w:vertAlign w:val="superscript"/>
+    </w:rPr>
+  </w:style>
+  <w:style w:type="character" w:styleId="EndnoteCharacters">
+    <w:name w:val="Endnote Characters"/>
     <w:rPr>
       <w:vertAlign w:val="superscript"/>
     </w:rPr>
@@ -1656,8 +1681,8 @@
       <w:szCs w:val="20"/>
     </w:rPr>
   </w:style>
-  <w:style w:type="character" w:styleId="Bullets">
-    <w:name w:val="Bullets"/>
+  <w:style w:type="character" w:styleId="Bulletsuser">
+    <w:name w:val="Bullets (user)"/>
     <w:rPr>
       <w:rFonts w:ascii="OpenSymbol" w:hAnsi="OpenSymbol" w:eastAsia="OpenSymbol" w:cs="OpenSymbol"/>
     </w:rPr>
@@ -1731,6 +1756,7 @@
     <w:qFormat/>
     <w:pPr>
       <w:widowControl/>
+      <w:suppressAutoHyphens w:val="true"/>
       <w:bidi w:val="0"/>
       <w:spacing w:before="0" w:after="0"/>
       <w:jc w:val="start"/>
@@ -1751,6 +1777,7 @@
     <w:qFormat/>
     <w:pPr>
       <w:widowControl/>
+      <w:suppressAutoHyphens w:val="true"/>
       <w:bidi w:val="0"/>
       <w:spacing w:before="0" w:after="0"/>
       <w:jc w:val="start"/>

</xml_diff>